<commit_message>
Subnetting on Demand, VLSM
</commit_message>
<xml_diff>
--- a/day 4/subnettingOnDemand.docx
+++ b/day 4/subnettingOnDemand.docx
@@ -19,15 +19,7 @@
     </w:p>
     <w:p>
       <w:r>
-        <w:t xml:space="preserve">Step 2= Add +2 (for network and broadcast </w:t>
-      </w:r>
-      <w:proofErr w:type="spellStart"/>
-      <w:r>
-        <w:t>ip</w:t>
-      </w:r>
-      <w:proofErr w:type="spellEnd"/>
-      <w:r>
-        <w:t>)</w:t>
+        <w:t>Step 2= Add +2 (for network and broadcast ip)</w:t>
       </w:r>
     </w:p>
     <w:p>
@@ -94,43 +86,14 @@
     <w:p>
       <w:r>
         <w:tab/>
-        <w:t xml:space="preserve">Then the </w:t>
-      </w:r>
-      <w:proofErr w:type="spellStart"/>
-      <w:r>
-        <w:t>ip</w:t>
-      </w:r>
-      <w:proofErr w:type="spellEnd"/>
-      <w:r>
-        <w:t xml:space="preserve"> ranges from 0-63, (Starting from 0 so </w:t>
-      </w:r>
-      <w:proofErr w:type="spellStart"/>
-      <w:r>
-        <w:t>upto</w:t>
-      </w:r>
-      <w:proofErr w:type="spellEnd"/>
-      <w:r>
-        <w:t xml:space="preserve"> 63)</w:t>
+        <w:t>Then the ip ranges from 0-63, (Starting from 0 so upto 63)</w:t>
       </w:r>
     </w:p>
     <w:p>
       <w:r>
         <w:tab/>
-        <w:t xml:space="preserve">Now usable </w:t>
-      </w:r>
-      <w:proofErr w:type="spellStart"/>
-      <w:r>
-        <w:t>ip</w:t>
-      </w:r>
-      <w:proofErr w:type="spellEnd"/>
-      <w:r>
-        <w:t xml:space="preserve"> ranges from 1-62, 0 for network and 63 </w:t>
-      </w:r>
-      <w:proofErr w:type="spellStart"/>
-      <w:r>
-        <w:t>forbroadcast</w:t>
-      </w:r>
-      <w:proofErr w:type="spellEnd"/>
+        <w:t>Now usable ip ranges from 1-62, 0 for network and 63 forbroadcast</w:t>
+      </w:r>
     </w:p>
     <w:p/>
     <w:p/>
@@ -143,15 +106,7 @@
     </w:p>
     <w:p>
       <w:r>
-        <w:t xml:space="preserve">Do same steps buts keep in mind that next </w:t>
-      </w:r>
-      <w:proofErr w:type="spellStart"/>
-      <w:r>
-        <w:t>ip</w:t>
-      </w:r>
-      <w:proofErr w:type="spellEnd"/>
-      <w:r>
-        <w:t xml:space="preserve"> range starts from previous department range 64-… ,  here also 1</w:t>
+        <w:t>Do same steps buts keep in mind that next ip range starts from previous department range 64-… ,  here also 1</w:t>
       </w:r>
       <w:r>
         <w:rPr>
@@ -165,48 +120,35 @@
     </w:p>
     <w:p/>
     <w:p>
-      <w:proofErr w:type="spellStart"/>
-      <w:r>
-        <w:t>Vlsm</w:t>
-      </w:r>
-      <w:proofErr w:type="spellEnd"/>
-      <w:r>
-        <w:t xml:space="preserve">(Variable length subnet mask)= it is used to minimize the wasted </w:t>
-      </w:r>
-      <w:proofErr w:type="spellStart"/>
-      <w:r>
-        <w:t>subnetmasks</w:t>
-      </w:r>
-      <w:proofErr w:type="spellEnd"/>
+      <w:r>
+        <w:t>Vlsm(Variable length subnet mask)= it is used to minimize the wasted subnetmasks.</w:t>
+      </w:r>
+    </w:p>
+    <w:p>
+      <w:r>
+        <w:t>different prefix lengths for different subnets instead of giving everyone the same size /24 each subnet gets exactly the size it needs</w:t>
+      </w:r>
       <w:r>
         <w:t>.</w:t>
       </w:r>
     </w:p>
     <w:p>
       <w:r>
-        <w:t>different prefix lengths for different subnets instead of giving everyone the same size /24 each subnet gets exactly the size it needs</w:t>
+        <w:t>Eg: Without VLSM (/24 for all) → 924 addresses wasted</w:t>
+      </w:r>
+    </w:p>
+    <w:p>
+      <w:r>
+        <w:t>With VLSM                  → 20  addresses wasted</w:t>
+      </w:r>
+    </w:p>
+    <w:p/>
+    <w:p>
+      <w:r>
+        <w:t>Subnetting helps to keep different isolated saving resources and time also with improving security</w:t>
       </w:r>
       <w:r>
         <w:t>.</w:t>
-      </w:r>
-    </w:p>
-    <w:p>
-      <w:r>
-        <w:t xml:space="preserve">Eg: </w:t>
-      </w:r>
-      <w:r>
-        <w:t>Without VLSM (/24 for all) → 924 addresses wasted</w:t>
-      </w:r>
-    </w:p>
-    <w:p>
-      <w:r>
-        <w:t>With VLSM                  → 20  addresses wasted</w:t>
-      </w:r>
-    </w:p>
-    <w:p/>
-    <w:p>
-      <w:r>
-        <w:t>Subnetting helps to keep different isolated saving resources and time also with improving security</w:t>
       </w:r>
     </w:p>
     <w:sectPr>
@@ -1464,6 +1406,7 @@
   <w:style w:type="character" w:default="1" w:styleId="DefaultParagraphFont">
     <w:name w:val="Default Paragraph Font"/>
     <w:uiPriority w:val="1"/>
+    <w:semiHidden/>
     <w:unhideWhenUsed/>
   </w:style>
   <w:style w:type="table" w:default="1" w:styleId="TableNormal">

</xml_diff>